<commit_message>
docs(submission): handwriting-style signature + check consent boxes in official form
- 별첨1·2 서명: '이재철 (인)'을 날림체 폰트(UnPenheulim 펜흘림)로 적용 — 손글씨 서명 느낌
- 별첨2 동의함 ■ 체크 (개인정보 수집·이용 / 저작물 이용 2곳)
- 별첨2 제출일 '일' 잔재 제거
- 표 구조 원본과 100% 동일 유지 (표11·셀136·행55)
</commit_message>
<xml_diff>
--- a/docs/submission/2026AI학습법공모전_이재철_2024112536_공식양식.docx
+++ b/docs/submission/2026AI학습법공모전_이재철_2024112536_공식양식.docx
@@ -1656,7 +1656,15 @@
               <w:rPr>
                 <w:rFonts w:hint="eastAsia"/>
               </w:rPr>
-              <w:t>서명: 이재철 (인)</w:t>
+              <w:t xml:space="preserve">서명: </w:t>
+            </w:r>
+            <w:r>
+              <w:rPr>
+                <w:rFonts w:ascii="UnPenheulim" w:eastAsia="UnPenheulim" w:hAnsi="UnPenheulim" w:hint="eastAsia"/>
+                <w:sz w:val="32"/>
+                <w:szCs w:val="32"/>
+              </w:rPr>
+              <w:t>이재철 (인)</w:t>
             </w:r>
           </w:p>
         </w:tc>
@@ -2139,7 +2147,7 @@
                     <w:rPr>
                       <w:rFonts w:hint="eastAsia"/>
                     </w:rPr>
-                    <w:t>동의함 □ 동의하지 않음 □</w:t>
+                    <w:t>동의함 ■ 동의하지 않음 □</w:t>
                   </w:r>
                 </w:p>
               </w:tc>
@@ -2475,7 +2483,7 @@
                     <w:rPr>
                       <w:rFonts w:hint="eastAsia"/>
                     </w:rPr>
-                    <w:t>동의함 □ 동의하지 않음 □</w:t>
+                    <w:t>동의함 ■ 동의하지 않음 □</w:t>
                   </w:r>
                 </w:p>
               </w:tc>
@@ -2579,7 +2587,7 @@
               <w:rPr>
                 <w:rFonts w:hint="eastAsia"/>
               </w:rPr>
-              <w:t xml:space="preserve"> 일</w:t>
+              <w:t xml:space="preserve"/>
             </w:r>
           </w:p>
           <w:p>
@@ -2602,7 +2610,15 @@
               <w:rPr>
                 <w:rFonts w:hint="eastAsia"/>
               </w:rPr>
-              <w:t>서명: 이재철 (인)</w:t>
+              <w:t xml:space="preserve">서명: </w:t>
+            </w:r>
+            <w:r>
+              <w:rPr>
+                <w:rFonts w:ascii="UnPenheulim" w:eastAsia="UnPenheulim" w:hAnsi="UnPenheulim" w:hint="eastAsia"/>
+                <w:sz w:val="32"/>
+                <w:szCs w:val="32"/>
+              </w:rPr>
+              <w:t>이재철 (인)</w:t>
             </w:r>
           </w:p>
         </w:tc>

</xml_diff>

<commit_message>
docs(submission): refresh final package artifacts
</commit_message>
<xml_diff>
--- a/docs/submission/2026AI학습법공모전_이재철_2024112536_공식양식.docx
+++ b/docs/submission/2026AI학습법공모전_이재철_2024112536_공식양식.docx
@@ -2604,7 +2604,7 @@
               <w:rPr>
                 <w:rFonts w:hint="eastAsia"/>
               </w:rPr>
-              <w:t xml:space="preserve">        </w:t>
+              <w:t xml:space="preserve">이재철        </w:t>
             </w:r>
             <w:r>
               <w:rPr>
@@ -2879,21 +2879,21 @@
               <w:rPr>
                 <w:rFonts w:hint="eastAsia"/>
               </w:rPr>
-              <w:t xml:space="preserve">OpenCode AI 코딩 어시스턴트, LLM 학습 에이전트(cliproxy)</w:t>
+              <w:t xml:space="preserve">Codex(OpenAI), cliproxy LLM</w:t>
             </w:r>
             <w:proofErr w:type="spellStart"/>
             <w:r>
               <w:rPr>
                 <w:rFonts w:hint="eastAsia"/>
               </w:rPr>
-              <w:t>NotebookLM</w:t>
+              <w:t/>
             </w:r>
             <w:proofErr w:type="spellEnd"/>
             <w:r>
               <w:rPr>
                 <w:rFonts w:hint="eastAsia"/>
               </w:rPr>
-              <w:t>, Cursor, v0, Notion AI 등</w:t>
+              <w:t/>
             </w:r>
           </w:p>
         </w:tc>
@@ -2955,28 +2955,28 @@
               <w:rPr>
                 <w:rFonts w:hint="eastAsia"/>
               </w:rPr>
-              <w:t xml:space="preserve">로컬 개발(VS Code+Vite+React+TS), 웹앱 BFF(node:http)</w:t>
+              <w:t xml:space="preserve">Node 22.22 / React 19.2.7 / Vite 6.4.3 / TS 5.9.3 / MP4 H.264 1280x720 55.52s</w:t>
             </w:r>
             <w:proofErr w:type="spellStart"/>
             <w:r>
               <w:rPr>
                 <w:rFonts w:hint="eastAsia"/>
               </w:rPr>
-              <w:t>모바일앱</w:t>
+              <w:t/>
             </w:r>
             <w:proofErr w:type="spellEnd"/>
             <w:r>
               <w:rPr>
                 <w:rFonts w:hint="eastAsia"/>
               </w:rPr>
-              <w:t xml:space="preserve">, 학교 제공 AI, API, </w:t>
+              <w:t xml:space="preserve"/>
             </w:r>
             <w:proofErr w:type="spellStart"/>
             <w:r>
               <w:rPr>
                 <w:rFonts w:hint="eastAsia"/>
               </w:rPr>
-              <w:t>버전명</w:t>
+              <w:t/>
             </w:r>
             <w:proofErr w:type="spellEnd"/>
             <w:r>
@@ -4114,7 +4114,7 @@
               <w:rPr>
                 <w:rFonts w:hint="eastAsia"/>
               </w:rPr>
-              <w:t>src/lib/ai/analyzer.ts 완성. 전체 테스트 115개 통과, 타입체크·빌드 정상. 동일 입력 동일 결과 보장.</w:t>
+              <w:t>src/lib/ai/analyzer.ts 완성. 전체 테스트 118개 통과, 타입체크·빌드 정상. 동일 입력 동일 결과 보장.</w:t>
             </w:r>
           </w:p>
         </w:tc>

</xml_diff>